<commit_message>
modify personal website: 2025.7.14 version
</commit_message>
<xml_diff>
--- a/assets/CV.docx
+++ b/assets/CV.docx
@@ -1,6 +1,6 @@
 
 <file path=word/document.xml><?xml version="1.0" encoding="utf-8"?>
-<w:document xmlns:wpc="http://schemas.microsoft.com/office/word/2010/wordprocessingCanvas" xmlns:cx="http://schemas.microsoft.com/office/drawing/2014/chartex" xmlns:cx1="http://schemas.microsoft.com/office/drawing/2015/9/8/chartex" xmlns:cx2="http://schemas.microsoft.com/office/drawing/2015/10/21/chartex" xmlns:cx3="http://schemas.microsoft.com/office/drawing/2016/5/9/chartex" xmlns:cx4="http://schemas.microsoft.com/office/drawing/2016/5/10/chartex" xmlns:cx5="http://schemas.microsoft.com/office/drawing/2016/5/11/chartex" xmlns:cx6="http://schemas.microsoft.com/office/drawing/2016/5/12/chartex" xmlns:cx7="http://schemas.microsoft.com/office/drawing/2016/5/13/chartex" xmlns:cx8="http://schemas.microsoft.com/office/drawing/2016/5/14/chartex" xmlns:mc="http://schemas.openxmlformats.org/markup-compatibility/2006" xmlns:aink="http://schemas.microsoft.com/office/drawing/2016/ink" xmlns:am3d="http://schemas.microsoft.com/office/drawing/2017/model3d" xmlns:o="urn:schemas-microsoft-com:office:office" xmlns:oel="http://schemas.microsoft.com/office/2019/extlst" xmlns:r="http://schemas.openxmlformats.org/officeDocument/2006/relationships" xmlns:m="http://schemas.openxmlformats.org/officeDocument/2006/math" xmlns:v="urn:schemas-microsoft-com:vml" xmlns:wp14="http://schemas.microsoft.com/office/word/2010/wordprocessingDrawing" xmlns:wp="http://schemas.openxmlformats.org/drawingml/2006/wordprocessingDrawing" xmlns:w10="urn:schemas-microsoft-com:office:word" xmlns:w="http://schemas.openxmlformats.org/wordprocessingml/2006/main" xmlns:w14="http://schemas.microsoft.com/office/word/2010/wordml" xmlns:w15="http://schemas.microsoft.com/office/word/2012/wordml" xmlns:w16cex="http://schemas.microsoft.com/office/word/2018/wordml/cex" xmlns:w16cid="http://schemas.microsoft.com/office/word/2016/wordml/cid" xmlns:w16="http://schemas.microsoft.com/office/word/2018/wordml" xmlns:w16sdtdh="http://schemas.microsoft.com/office/word/2020/wordml/sdtdatahash" xmlns:w16se="http://schemas.microsoft.com/office/word/2015/wordml/symex" xmlns:wpg="http://schemas.microsoft.com/office/word/2010/wordprocessingGroup" xmlns:wpi="http://schemas.microsoft.com/office/word/2010/wordprocessingInk" xmlns:wne="http://schemas.microsoft.com/office/word/2006/wordml" xmlns:wps="http://schemas.microsoft.com/office/word/2010/wordprocessingShape" mc:Ignorable="w14 w15 w16se w16cid w16 w16cex w16sdtdh wp14">
+<w:document xmlns:wpc="http://schemas.microsoft.com/office/word/2010/wordprocessingCanvas" xmlns:cx="http://schemas.microsoft.com/office/drawing/2014/chartex" xmlns:cx1="http://schemas.microsoft.com/office/drawing/2015/9/8/chartex" xmlns:cx2="http://schemas.microsoft.com/office/drawing/2015/10/21/chartex" xmlns:cx3="http://schemas.microsoft.com/office/drawing/2016/5/9/chartex" xmlns:cx4="http://schemas.microsoft.com/office/drawing/2016/5/10/chartex" xmlns:cx5="http://schemas.microsoft.com/office/drawing/2016/5/11/chartex" xmlns:cx6="http://schemas.microsoft.com/office/drawing/2016/5/12/chartex" xmlns:cx7="http://schemas.microsoft.com/office/drawing/2016/5/13/chartex" xmlns:cx8="http://schemas.microsoft.com/office/drawing/2016/5/14/chartex" xmlns:mc="http://schemas.openxmlformats.org/markup-compatibility/2006" xmlns:aink="http://schemas.microsoft.com/office/drawing/2016/ink" xmlns:am3d="http://schemas.microsoft.com/office/drawing/2017/model3d" xmlns:o="urn:schemas-microsoft-com:office:office" xmlns:oel="http://schemas.microsoft.com/office/2019/extlst" xmlns:r="http://schemas.openxmlformats.org/officeDocument/2006/relationships" xmlns:m="http://schemas.openxmlformats.org/officeDocument/2006/math" xmlns:v="urn:schemas-microsoft-com:vml" xmlns:wp14="http://schemas.microsoft.com/office/word/2010/wordprocessingDrawing" xmlns:wp="http://schemas.openxmlformats.org/drawingml/2006/wordprocessingDrawing" xmlns:w10="urn:schemas-microsoft-com:office:word" xmlns:w="http://schemas.openxmlformats.org/wordprocessingml/2006/main" xmlns:w14="http://schemas.microsoft.com/office/word/2010/wordml" xmlns:w15="http://schemas.microsoft.com/office/word/2012/wordml" xmlns:w16cex="http://schemas.microsoft.com/office/word/2018/wordml/cex" xmlns:w16cid="http://schemas.microsoft.com/office/word/2016/wordml/cid" xmlns:w16="http://schemas.microsoft.com/office/word/2018/wordml" xmlns:w16du="http://schemas.microsoft.com/office/word/2023/wordml/word16du" xmlns:w16sdtdh="http://schemas.microsoft.com/office/word/2020/wordml/sdtdatahash" xmlns:w16se="http://schemas.microsoft.com/office/word/2015/wordml/symex" xmlns:wpg="http://schemas.microsoft.com/office/word/2010/wordprocessingGroup" xmlns:wpi="http://schemas.microsoft.com/office/word/2010/wordprocessingInk" xmlns:wne="http://schemas.microsoft.com/office/word/2006/wordml" xmlns:wps="http://schemas.microsoft.com/office/word/2010/wordprocessingShape" mc:Ignorable="w14 w15 w16se w16cid w16 w16cex w16sdtdh w16du wp14">
   <w:body>
     <w:p>
       <w:pPr>
@@ -14,6 +14,7 @@
           <w:szCs w:val="28"/>
         </w:rPr>
       </w:pPr>
+      <w:proofErr w:type="spellStart"/>
       <w:r>
         <w:rPr>
           <w:rFonts w:ascii="Times New Roman" w:hAnsi="Times New Roman" w:cs="Times New Roman"/>
@@ -22,7 +23,18 @@
           <w:sz w:val="28"/>
           <w:szCs w:val="28"/>
         </w:rPr>
-        <w:t>Zhiyu Wu</w:t>
+        <w:t>Zhiyu</w:t>
+      </w:r>
+      <w:proofErr w:type="spellEnd"/>
+      <w:r>
+        <w:rPr>
+          <w:rFonts w:ascii="Times New Roman" w:hAnsi="Times New Roman" w:cs="Times New Roman"/>
+          <w:b/>
+          <w:bCs/>
+          <w:sz w:val="28"/>
+          <w:szCs w:val="28"/>
+        </w:rPr>
+        <w:t xml:space="preserve"> Wu</w:t>
       </w:r>
     </w:p>
     <w:p>
@@ -30,7 +42,7 @@
         <w:spacing w:after="0" w:line="240" w:lineRule="auto"/>
         <w:jc w:val="center"/>
         <w:rPr>
-          <w:rFonts w:ascii="Times New Roman" w:hAnsi="Times New Roman" w:cs="Times New Roman" w:hint="eastAsia"/>
+          <w:rFonts w:ascii="Times New Roman" w:hAnsi="Times New Roman" w:cs="Times New Roman"/>
           <w:lang w:eastAsia="zh-CN"/>
         </w:rPr>
       </w:pPr>
@@ -516,7 +528,7 @@
           <w:rFonts w:ascii="Times New Roman" w:hAnsi="Times New Roman"/>
           <w:lang w:eastAsia="zh-CN"/>
         </w:rPr>
-        <w:t>systems</w:t>
+        <w:t>systems.</w:t>
       </w:r>
     </w:p>
     <w:p>
@@ -812,7 +824,23 @@
           <w:rFonts w:ascii="Times New Roman" w:hAnsi="Times New Roman"/>
           <w:lang w:eastAsia="zh-CN"/>
         </w:rPr>
-        <w:t>Latency-Intensive: SLO based on Quality of Experience (QoE).</w:t>
+        <w:t>Latency-Intensive: SLO based on Quality of Experience (</w:t>
+      </w:r>
+      <w:proofErr w:type="spellStart"/>
+      <w:r>
+        <w:rPr>
+          <w:rFonts w:ascii="Times New Roman" w:hAnsi="Times New Roman"/>
+          <w:lang w:eastAsia="zh-CN"/>
+        </w:rPr>
+        <w:t>QoE</w:t>
+      </w:r>
+      <w:proofErr w:type="spellEnd"/>
+      <w:r>
+        <w:rPr>
+          <w:rFonts w:ascii="Times New Roman" w:hAnsi="Times New Roman"/>
+          <w:lang w:eastAsia="zh-CN"/>
+        </w:rPr>
+        <w:t>).</w:t>
       </w:r>
     </w:p>
     <w:p>
@@ -983,6 +1011,7 @@
         </w:rPr>
         <w:t xml:space="preserve">Supervisor: </w:t>
       </w:r>
+      <w:proofErr w:type="spellStart"/>
       <w:r>
         <w:rPr>
           <w:rFonts w:ascii="Times New Roman" w:hAnsi="Times New Roman"/>
@@ -991,6 +1020,7 @@
         </w:rPr>
         <w:t>Mosharaf</w:t>
       </w:r>
+      <w:proofErr w:type="spellEnd"/>
       <w:r>
         <w:rPr>
           <w:rFonts w:ascii="Times New Roman" w:hAnsi="Times New Roman" w:hint="eastAsia"/>
@@ -1071,7 +1101,23 @@
           <w:rFonts w:ascii="Times New Roman" w:hAnsi="Times New Roman"/>
           <w:lang w:eastAsia="zh-CN"/>
         </w:rPr>
-        <w:t>Defined Quality of Experience (QoE) in LLM serving by tracking each step of text generation and monitoring the overall user experience throughout the entire streaming process.</w:t>
+        <w:t>Defined Quality of Experience (</w:t>
+      </w:r>
+      <w:proofErr w:type="spellStart"/>
+      <w:r>
+        <w:rPr>
+          <w:rFonts w:ascii="Times New Roman" w:hAnsi="Times New Roman"/>
+          <w:lang w:eastAsia="zh-CN"/>
+        </w:rPr>
+        <w:t>QoE</w:t>
+      </w:r>
+      <w:proofErr w:type="spellEnd"/>
+      <w:r>
+        <w:rPr>
+          <w:rFonts w:ascii="Times New Roman" w:hAnsi="Times New Roman"/>
+          <w:lang w:eastAsia="zh-CN"/>
+        </w:rPr>
+        <w:t>) in LLM serving by tracking each step of text generation and monitoring the overall user experience throughout the entire streaming process.</w:t>
       </w:r>
     </w:p>
     <w:p>
@@ -1092,7 +1138,23 @@
           <w:rFonts w:ascii="Times New Roman" w:hAnsi="Times New Roman"/>
           <w:lang w:eastAsia="zh-CN"/>
         </w:rPr>
-        <w:t>Formulated the problem as a knapsack optimization and developed a scheduling algorithm to maximize QoE in online LLM serving.</w:t>
+        <w:t xml:space="preserve">Formulated the problem as a knapsack optimization and developed a scheduling algorithm to maximize </w:t>
+      </w:r>
+      <w:proofErr w:type="spellStart"/>
+      <w:r>
+        <w:rPr>
+          <w:rFonts w:ascii="Times New Roman" w:hAnsi="Times New Roman"/>
+          <w:lang w:eastAsia="zh-CN"/>
+        </w:rPr>
+        <w:t>QoE</w:t>
+      </w:r>
+      <w:proofErr w:type="spellEnd"/>
+      <w:r>
+        <w:rPr>
+          <w:rFonts w:ascii="Times New Roman" w:hAnsi="Times New Roman"/>
+          <w:lang w:eastAsia="zh-CN"/>
+        </w:rPr>
+        <w:t xml:space="preserve"> in online LLM serving.</w:t>
       </w:r>
     </w:p>
     <w:p>
@@ -1112,7 +1174,39 @@
           <w:rFonts w:ascii="Times New Roman" w:hAnsi="Times New Roman"/>
           <w:lang w:eastAsia="zh-CN"/>
         </w:rPr>
-        <w:t>Built Andes, an LLM serving system on top of vLLM, integrating the scheduling algorithm to enhance QoE in real-time LLM services.</w:t>
+        <w:t xml:space="preserve">Built Andes, an LLM serving system on top of </w:t>
+      </w:r>
+      <w:proofErr w:type="spellStart"/>
+      <w:r>
+        <w:rPr>
+          <w:rFonts w:ascii="Times New Roman" w:hAnsi="Times New Roman"/>
+          <w:lang w:eastAsia="zh-CN"/>
+        </w:rPr>
+        <w:t>vLLM</w:t>
+      </w:r>
+      <w:proofErr w:type="spellEnd"/>
+      <w:r>
+        <w:rPr>
+          <w:rFonts w:ascii="Times New Roman" w:hAnsi="Times New Roman"/>
+          <w:lang w:eastAsia="zh-CN"/>
+        </w:rPr>
+        <w:t xml:space="preserve">, integrating the scheduling algorithm to enhance </w:t>
+      </w:r>
+      <w:proofErr w:type="spellStart"/>
+      <w:r>
+        <w:rPr>
+          <w:rFonts w:ascii="Times New Roman" w:hAnsi="Times New Roman"/>
+          <w:lang w:eastAsia="zh-CN"/>
+        </w:rPr>
+        <w:t>QoE</w:t>
+      </w:r>
+      <w:proofErr w:type="spellEnd"/>
+      <w:r>
+        <w:rPr>
+          <w:rFonts w:ascii="Times New Roman" w:hAnsi="Times New Roman"/>
+          <w:lang w:eastAsia="zh-CN"/>
+        </w:rPr>
+        <w:t xml:space="preserve"> in real-time LLM services.</w:t>
       </w:r>
     </w:p>
     <w:p>
@@ -1199,6 +1293,7 @@
         </w:rPr>
         <w:t xml:space="preserve">; Preprint, 2024; Jiachen Liu, </w:t>
       </w:r>
+      <w:proofErr w:type="spellStart"/>
       <w:r>
         <w:rPr>
           <w:rFonts w:ascii="Times New Roman" w:hAnsi="Times New Roman"/>
@@ -1207,15 +1302,62 @@
           <w:iCs/>
           <w:lang w:eastAsia="zh-CN"/>
         </w:rPr>
-        <w:t>Zhiyu Wu</w:t>
-      </w:r>
-      <w:r>
-        <w:rPr>
-          <w:rFonts w:ascii="Times New Roman" w:hAnsi="Times New Roman"/>
+        <w:t>Zhiyu</w:t>
+      </w:r>
+      <w:proofErr w:type="spellEnd"/>
+      <w:r>
+        <w:rPr>
+          <w:rFonts w:ascii="Times New Roman" w:hAnsi="Times New Roman"/>
+          <w:b/>
+          <w:bCs/>
           <w:iCs/>
           <w:lang w:eastAsia="zh-CN"/>
         </w:rPr>
-        <w:t>, Jae-Won Chung, Fan Lai, Myungjin Lee, Mosharaf Chowdhury</w:t>
+        <w:t xml:space="preserve"> Wu</w:t>
+      </w:r>
+      <w:r>
+        <w:rPr>
+          <w:rFonts w:ascii="Times New Roman" w:hAnsi="Times New Roman"/>
+          <w:iCs/>
+          <w:lang w:eastAsia="zh-CN"/>
+        </w:rPr>
+        <w:t xml:space="preserve">, Jae-Won Chung, Fan Lai, </w:t>
+      </w:r>
+      <w:proofErr w:type="spellStart"/>
+      <w:r>
+        <w:rPr>
+          <w:rFonts w:ascii="Times New Roman" w:hAnsi="Times New Roman"/>
+          <w:iCs/>
+          <w:lang w:eastAsia="zh-CN"/>
+        </w:rPr>
+        <w:t>Myungjin</w:t>
+      </w:r>
+      <w:proofErr w:type="spellEnd"/>
+      <w:r>
+        <w:rPr>
+          <w:rFonts w:ascii="Times New Roman" w:hAnsi="Times New Roman"/>
+          <w:iCs/>
+          <w:lang w:eastAsia="zh-CN"/>
+        </w:rPr>
+        <w:t xml:space="preserve"> Lee, </w:t>
+      </w:r>
+      <w:proofErr w:type="spellStart"/>
+      <w:r>
+        <w:rPr>
+          <w:rFonts w:ascii="Times New Roman" w:hAnsi="Times New Roman"/>
+          <w:iCs/>
+          <w:lang w:eastAsia="zh-CN"/>
+        </w:rPr>
+        <w:t>Mosharaf</w:t>
+      </w:r>
+      <w:proofErr w:type="spellEnd"/>
+      <w:r>
+        <w:rPr>
+          <w:rFonts w:ascii="Times New Roman" w:hAnsi="Times New Roman"/>
+          <w:iCs/>
+          <w:lang w:eastAsia="zh-CN"/>
+        </w:rPr>
+        <w:t xml:space="preserve"> Chowdhury</w:t>
       </w:r>
     </w:p>
     <w:p>
@@ -1383,7 +1525,23 @@
           <w:lang w:eastAsia="zh-CN"/>
         </w:rPr>
         <w:lastRenderedPageBreak/>
-        <w:t>Developed the ML.ENERGY Leaderboard, an open-source platform for benchmarking the energy efficiency and NLP performance of LLM models.</w:t>
+        <w:t xml:space="preserve">Developed the </w:t>
+      </w:r>
+      <w:proofErr w:type="gramStart"/>
+      <w:r>
+        <w:rPr>
+          <w:rFonts w:ascii="Times New Roman" w:hAnsi="Times New Roman"/>
+          <w:lang w:eastAsia="zh-CN"/>
+        </w:rPr>
+        <w:t>ML.ENERGY</w:t>
+      </w:r>
+      <w:proofErr w:type="gramEnd"/>
+      <w:r>
+        <w:rPr>
+          <w:rFonts w:ascii="Times New Roman" w:hAnsi="Times New Roman"/>
+          <w:lang w:eastAsia="zh-CN"/>
+        </w:rPr>
+        <w:t xml:space="preserve"> Leaderboard, an open-source platform for benchmarking the energy efficiency and NLP performance of LLM models.</w:t>
       </w:r>
     </w:p>
     <w:p>
@@ -2163,7 +2321,25 @@
           <w:iCs/>
           <w:lang w:eastAsia="zh-CN"/>
         </w:rPr>
-        <w:t>C++, C, Python, Rust, Pytorch, CUDA</w:t>
+        <w:t xml:space="preserve">C++, C, Python, Rust, </w:t>
+      </w:r>
+      <w:proofErr w:type="spellStart"/>
+      <w:r>
+        <w:rPr>
+          <w:rFonts w:ascii="Times New Roman" w:hAnsi="Times New Roman"/>
+          <w:iCs/>
+          <w:lang w:eastAsia="zh-CN"/>
+        </w:rPr>
+        <w:t>Pytorch</w:t>
+      </w:r>
+      <w:proofErr w:type="spellEnd"/>
+      <w:r>
+        <w:rPr>
+          <w:rFonts w:ascii="Times New Roman" w:hAnsi="Times New Roman"/>
+          <w:iCs/>
+          <w:lang w:eastAsia="zh-CN"/>
+        </w:rPr>
+        <w:t>, CUDA</w:t>
       </w:r>
       <w:r>
         <w:rPr>
@@ -2238,6 +2414,7 @@
         </w:rPr>
         <w:t xml:space="preserve">Dean List, </w:t>
       </w:r>
+      <w:proofErr w:type="spellStart"/>
       <w:r>
         <w:rPr>
           <w:rFonts w:ascii="Times New Roman" w:hAnsi="Times New Roman" w:hint="eastAsia"/>
@@ -2247,6 +2424,7 @@
         </w:rPr>
         <w:t>Umich</w:t>
       </w:r>
+      <w:proofErr w:type="spellEnd"/>
       <w:r>
         <w:rPr>
           <w:rFonts w:ascii="Times New Roman" w:hAnsi="Times New Roman"/>
@@ -2282,6 +2460,7 @@
         </w:rPr>
         <w:t xml:space="preserve">University Honor, </w:t>
       </w:r>
+      <w:proofErr w:type="spellStart"/>
       <w:r>
         <w:rPr>
           <w:rFonts w:ascii="Times New Roman" w:hAnsi="Times New Roman" w:hint="eastAsia"/>
@@ -2291,6 +2470,7 @@
         </w:rPr>
         <w:t>Umich</w:t>
       </w:r>
+      <w:proofErr w:type="spellEnd"/>
       <w:r>
         <w:rPr>
           <w:rFonts w:ascii="Times New Roman" w:hAnsi="Times New Roman"/>
@@ -2328,7 +2508,23 @@
           <w:rFonts w:ascii="Times New Roman" w:hAnsi="Times New Roman" w:hint="eastAsia"/>
           <w:lang w:eastAsia="zh-CN"/>
         </w:rPr>
-        <w:t>Tang Junyuan Scholarship,</w:t>
+        <w:t xml:space="preserve">Tang </w:t>
+      </w:r>
+      <w:proofErr w:type="spellStart"/>
+      <w:r>
+        <w:rPr>
+          <w:rFonts w:ascii="Times New Roman" w:hAnsi="Times New Roman" w:hint="eastAsia"/>
+          <w:lang w:eastAsia="zh-CN"/>
+        </w:rPr>
+        <w:t>Junyuan</w:t>
+      </w:r>
+      <w:proofErr w:type="spellEnd"/>
+      <w:r>
+        <w:rPr>
+          <w:rFonts w:ascii="Times New Roman" w:hAnsi="Times New Roman" w:hint="eastAsia"/>
+          <w:lang w:eastAsia="zh-CN"/>
+        </w:rPr>
+        <w:t xml:space="preserve"> Scholarship,</w:t>
       </w:r>
       <w:r>
         <w:rPr>
@@ -2430,7 +2626,7 @@
 </file>
 
 <file path=word/numbering.xml><?xml version="1.0" encoding="utf-8"?>
-<w:numbering xmlns:wpc="http://schemas.microsoft.com/office/word/2010/wordprocessingCanvas" xmlns:cx="http://schemas.microsoft.com/office/drawing/2014/chartex" xmlns:cx1="http://schemas.microsoft.com/office/drawing/2015/9/8/chartex" xmlns:cx2="http://schemas.microsoft.com/office/drawing/2015/10/21/chartex" xmlns:cx3="http://schemas.microsoft.com/office/drawing/2016/5/9/chartex" xmlns:cx4="http://schemas.microsoft.com/office/drawing/2016/5/10/chartex" xmlns:cx5="http://schemas.microsoft.com/office/drawing/2016/5/11/chartex" xmlns:cx6="http://schemas.microsoft.com/office/drawing/2016/5/12/chartex" xmlns:cx7="http://schemas.microsoft.com/office/drawing/2016/5/13/chartex" xmlns:cx8="http://schemas.microsoft.com/office/drawing/2016/5/14/chartex" xmlns:mc="http://schemas.openxmlformats.org/markup-compatibility/2006" xmlns:aink="http://schemas.microsoft.com/office/drawing/2016/ink" xmlns:am3d="http://schemas.microsoft.com/office/drawing/2017/model3d" xmlns:o="urn:schemas-microsoft-com:office:office" xmlns:oel="http://schemas.microsoft.com/office/2019/extlst" xmlns:r="http://schemas.openxmlformats.org/officeDocument/2006/relationships" xmlns:m="http://schemas.openxmlformats.org/officeDocument/2006/math" xmlns:v="urn:schemas-microsoft-com:vml" xmlns:wp14="http://schemas.microsoft.com/office/word/2010/wordprocessingDrawing" xmlns:wp="http://schemas.openxmlformats.org/drawingml/2006/wordprocessingDrawing" xmlns:w10="urn:schemas-microsoft-com:office:word" xmlns:w="http://schemas.openxmlformats.org/wordprocessingml/2006/main" xmlns:w14="http://schemas.microsoft.com/office/word/2010/wordml" xmlns:w15="http://schemas.microsoft.com/office/word/2012/wordml" xmlns:w16cex="http://schemas.microsoft.com/office/word/2018/wordml/cex" xmlns:w16cid="http://schemas.microsoft.com/office/word/2016/wordml/cid" xmlns:w16="http://schemas.microsoft.com/office/word/2018/wordml" xmlns:w16sdtdh="http://schemas.microsoft.com/office/word/2020/wordml/sdtdatahash" xmlns:w16se="http://schemas.microsoft.com/office/word/2015/wordml/symex" xmlns:wpg="http://schemas.microsoft.com/office/word/2010/wordprocessingGroup" xmlns:wpi="http://schemas.microsoft.com/office/word/2010/wordprocessingInk" xmlns:wne="http://schemas.microsoft.com/office/word/2006/wordml" xmlns:wps="http://schemas.microsoft.com/office/word/2010/wordprocessingShape" mc:Ignorable="w14 w15 w16se w16cid w16 w16cex w16sdtdh wp14">
+<w:numbering xmlns:wpc="http://schemas.microsoft.com/office/word/2010/wordprocessingCanvas" xmlns:cx="http://schemas.microsoft.com/office/drawing/2014/chartex" xmlns:cx1="http://schemas.microsoft.com/office/drawing/2015/9/8/chartex" xmlns:cx2="http://schemas.microsoft.com/office/drawing/2015/10/21/chartex" xmlns:cx3="http://schemas.microsoft.com/office/drawing/2016/5/9/chartex" xmlns:cx4="http://schemas.microsoft.com/office/drawing/2016/5/10/chartex" xmlns:cx5="http://schemas.microsoft.com/office/drawing/2016/5/11/chartex" xmlns:cx6="http://schemas.microsoft.com/office/drawing/2016/5/12/chartex" xmlns:cx7="http://schemas.microsoft.com/office/drawing/2016/5/13/chartex" xmlns:cx8="http://schemas.microsoft.com/office/drawing/2016/5/14/chartex" xmlns:mc="http://schemas.openxmlformats.org/markup-compatibility/2006" xmlns:aink="http://schemas.microsoft.com/office/drawing/2016/ink" xmlns:am3d="http://schemas.microsoft.com/office/drawing/2017/model3d" xmlns:o="urn:schemas-microsoft-com:office:office" xmlns:oel="http://schemas.microsoft.com/office/2019/extlst" xmlns:r="http://schemas.openxmlformats.org/officeDocument/2006/relationships" xmlns:m="http://schemas.openxmlformats.org/officeDocument/2006/math" xmlns:v="urn:schemas-microsoft-com:vml" xmlns:wp14="http://schemas.microsoft.com/office/word/2010/wordprocessingDrawing" xmlns:wp="http://schemas.openxmlformats.org/drawingml/2006/wordprocessingDrawing" xmlns:w10="urn:schemas-microsoft-com:office:word" xmlns:w="http://schemas.openxmlformats.org/wordprocessingml/2006/main" xmlns:w14="http://schemas.microsoft.com/office/word/2010/wordml" xmlns:w15="http://schemas.microsoft.com/office/word/2012/wordml" xmlns:w16cex="http://schemas.microsoft.com/office/word/2018/wordml/cex" xmlns:w16cid="http://schemas.microsoft.com/office/word/2016/wordml/cid" xmlns:w16="http://schemas.microsoft.com/office/word/2018/wordml" xmlns:w16du="http://schemas.microsoft.com/office/word/2023/wordml/word16du" xmlns:w16sdtdh="http://schemas.microsoft.com/office/word/2020/wordml/sdtdatahash" xmlns:w16se="http://schemas.microsoft.com/office/word/2015/wordml/symex" xmlns:wpg="http://schemas.microsoft.com/office/word/2010/wordprocessingGroup" xmlns:wpi="http://schemas.microsoft.com/office/word/2010/wordprocessingInk" xmlns:wne="http://schemas.microsoft.com/office/word/2006/wordml" xmlns:wps="http://schemas.microsoft.com/office/word/2010/wordprocessingShape" mc:Ignorable="w14 w15 w16se w16cid w16 w16cex w16sdtdh w16du wp14">
   <w:abstractNum w:abstractNumId="0" w15:restartNumberingAfterBreak="0">
     <w:nsid w:val="03910F2B"/>
     <w:multiLevelType w:val="multilevel"/>
@@ -5331,7 +5527,7 @@
 </file>
 
 <file path=word/styles.xml><?xml version="1.0" encoding="utf-8"?>
-<w:styles xmlns:mc="http://schemas.openxmlformats.org/markup-compatibility/2006" xmlns:r="http://schemas.openxmlformats.org/officeDocument/2006/relationships" xmlns:w="http://schemas.openxmlformats.org/wordprocessingml/2006/main" xmlns:w14="http://schemas.microsoft.com/office/word/2010/wordml" xmlns:w15="http://schemas.microsoft.com/office/word/2012/wordml" xmlns:w16cex="http://schemas.microsoft.com/office/word/2018/wordml/cex" xmlns:w16cid="http://schemas.microsoft.com/office/word/2016/wordml/cid" xmlns:w16="http://schemas.microsoft.com/office/word/2018/wordml" xmlns:w16sdtdh="http://schemas.microsoft.com/office/word/2020/wordml/sdtdatahash" xmlns:w16se="http://schemas.microsoft.com/office/word/2015/wordml/symex" mc:Ignorable="w14 w15 w16se w16cid w16 w16cex w16sdtdh">
+<w:styles xmlns:mc="http://schemas.openxmlformats.org/markup-compatibility/2006" xmlns:r="http://schemas.openxmlformats.org/officeDocument/2006/relationships" xmlns:w="http://schemas.openxmlformats.org/wordprocessingml/2006/main" xmlns:w14="http://schemas.microsoft.com/office/word/2010/wordml" xmlns:w15="http://schemas.microsoft.com/office/word/2012/wordml" xmlns:w16cex="http://schemas.microsoft.com/office/word/2018/wordml/cex" xmlns:w16cid="http://schemas.microsoft.com/office/word/2016/wordml/cid" xmlns:w16="http://schemas.microsoft.com/office/word/2018/wordml" xmlns:w16du="http://schemas.microsoft.com/office/word/2023/wordml/word16du" xmlns:w16sdtdh="http://schemas.microsoft.com/office/word/2020/wordml/sdtdatahash" xmlns:w16se="http://schemas.microsoft.com/office/word/2015/wordml/symex" mc:Ignorable="w14 w15 w16se w16cid w16 w16cex w16sdtdh w16du">
   <w:docDefaults>
     <w:rPrDefault>
       <w:rPr>

</xml_diff>